<commit_message>
Actualizar reporte en Word (DOCX) con nuevas correcciones
</commit_message>
<xml_diff>
--- a/Reporte_Pruebas_Sistema_Ana_Tiburcio.docx
+++ b/Reporte_Pruebas_Sistema_Ana_Tiburcio.docx
@@ -428,7 +428,7 @@
                 <w:sz w:val="22"/>
                 <w:szCs w:val="22"/>
               </w:rPr>
-              <w:t xml:space="preserve">53 Estudiantes registrados, 5 Cursos principales creados, 159 Calificaciones reales promediadas, 75 Registros de asistencia diaria.</w:t>
+              <w:t xml:space="preserve">66 Cursos organizados por sección (Inicial A/B, 1ro–6to A/B) con maestros asignados, 53 Estudiantes registrados por grado y sexo, 159 Calificaciones reales promediadas, 75 Registros de asistencia diaria.</w:t>
             </w:r>
           </w:p>
         </w:tc>
@@ -1198,7 +1198,7 @@
           <w:sz w:val="24"/>
           <w:szCs w:val="24"/>
         </w:rPr>
-        <w:t xml:space="preserve">Caso de Prueba [CP-03]: Planificación y Registro de Cursos</w:t>
+        <w:t xml:space="preserve">Caso de Prueba [CP-03]: Gestión de Cursos por Sección con Cupos y Maestro Asignado</w:t>
       </w:r>
     </w:p>
     <w:p>
@@ -1232,41 +1232,41 @@
           <w:sz w:val="24"/>
           <w:szCs w:val="24"/>
         </w:rPr>
-        <w:t xml:space="preserve">• Entrada: Nombre: 'Física Avanzada II', Profesor: 'Prof. Carlos Artemio Mendoza', Horario: 'Viernes 2:00 PM - 5:00 PM', Aula: 'Laboratorio A', Capacidad: 25</w:t>
-      </w:r>
-    </w:p>
-    <w:p>
-      <w:pPr>
-        <w:spacing w:after="120"/>
-      </w:pPr>
-      <w:r>
-        <w:rPr>
-          <w:rFonts w:ascii="Calibri" w:cs="Calibri" w:eastAsia="Calibri" w:hAnsi="Calibri"/>
-          <w:b w:val="false"/>
-          <w:bCs w:val="false"/>
-          <w:i w:val="false"/>
-          <w:iCs w:val="false"/>
-          <w:sz w:val="24"/>
-          <w:szCs w:val="24"/>
-        </w:rPr>
-        <w:t xml:space="preserve">• Resultado Esperado: Curso guardado y listado dinámicamente en el catálogo de Cursos.</w:t>
-      </w:r>
-    </w:p>
-    <w:p>
-      <w:pPr>
-        <w:spacing w:after="120"/>
-      </w:pPr>
-      <w:r>
-        <w:rPr>
-          <w:rFonts w:ascii="Calibri" w:cs="Calibri" w:eastAsia="Calibri" w:hAnsi="Calibri"/>
-          <w:b w:val="false"/>
-          <w:bCs w:val="false"/>
-          <w:i w:val="false"/>
-          <w:iCs w:val="false"/>
-          <w:sz w:val="24"/>
-          <w:szCs w:val="24"/>
-        </w:rPr>
-        <w:t xml:space="preserve">• Resultado Obtenido: Exitoso. Registro listado correctamente.</w:t>
+        <w:t xml:space="preserve">• Entrada: Módulo 'Cursos y Secciones'. Tabla de 14 secciones (Inicial A/B, 1er Grado A/B … 6to Grado A/B). Clic en ✏️ de Sección '2do Grado A' para cambiar maestro a 'Profa. Elena Cruz'. Crear nueva materia con sección '3er Grado B', cupo máx 38.</w:t>
+      </w:r>
+    </w:p>
+    <w:p>
+      <w:pPr>
+        <w:spacing w:after="120"/>
+      </w:pPr>
+      <w:r>
+        <w:rPr>
+          <w:rFonts w:ascii="Calibri" w:cs="Calibri" w:eastAsia="Calibri" w:hAnsi="Calibri"/>
+          <w:b w:val="false"/>
+          <w:bCs w:val="false"/>
+          <w:i w:val="false"/>
+          <w:iCs w:val="false"/>
+          <w:sz w:val="24"/>
+          <w:szCs w:val="24"/>
+        </w:rPr>
+        <w:t xml:space="preserve">• Resultado Esperado: Tabla refleja cupos reales desde BD (♀ Femenino + ♂ Masculino). Maestro actualizado al instante en todas las materias de esa sección. Validación bloquea inscritos &gt; cupo máximo.</w:t>
+      </w:r>
+    </w:p>
+    <w:p>
+      <w:pPr>
+        <w:spacing w:after="120"/>
+      </w:pPr>
+      <w:r>
+        <w:rPr>
+          <w:rFonts w:ascii="Calibri" w:cs="Calibri" w:eastAsia="Calibri" w:hAnsi="Calibri"/>
+          <w:b w:val="false"/>
+          <w:bCs w:val="false"/>
+          <w:i w:val="false"/>
+          <w:iCs w:val="false"/>
+          <w:sz w:val="24"/>
+          <w:szCs w:val="24"/>
+        </w:rPr>
+        <w:t xml:space="preserve">• Resultado Obtenido: Exitoso. Tabla con columnas ♀/♂ reales, barra de ocupación dinámica y edición inline del maestro guardada correctamente en MySQL.</w:t>
       </w:r>
     </w:p>
     <w:p>
@@ -1575,7 +1575,7 @@
           <w:sz w:val="24"/>
           <w:szCs w:val="24"/>
         </w:rPr>
-        <w:t xml:space="preserve">• Resultado Obtenido: Exitoso. Carga de la API y renderizado gráfico completados en 680ms.</w:t>
+        <w:t xml:space="preserve">• Resultado Obtenido: Exitoso. Carga de la API and renderizado gráfico completados en 680ms.</w:t>
       </w:r>
     </w:p>
     <w:p>
@@ -1988,6 +1988,212 @@
           <w:szCs w:val="24"/>
         </w:rPr>
         <w:t xml:space="preserve">• Resultado Obtenido: Exitoso. Alerta visual activada en el cliente.</w:t>
+      </w:r>
+    </w:p>
+    <w:p>
+      <w:pPr>
+        <w:spacing w:after="120"/>
+      </w:pPr>
+      <w:r>
+        <w:rPr>
+          <w:rFonts w:ascii="Calibri" w:cs="Calibri" w:eastAsia="Calibri" w:hAnsi="Calibri"/>
+          <w:b/>
+          <w:bCs/>
+          <w:i w:val="false"/>
+          <w:iCs w:val="false"/>
+          <w:sz w:val="24"/>
+          <w:szCs w:val="24"/>
+        </w:rPr>
+        <w:t xml:space="preserve">• Estado: PASA</w:t>
+      </w:r>
+    </w:p>
+    <w:p/>
+    <w:p>
+      <w:pPr>
+        <w:spacing w:after="120"/>
+      </w:pPr>
+      <w:r>
+        <w:rPr>
+          <w:rFonts w:ascii="Calibri" w:cs="Calibri" w:eastAsia="Calibri" w:hAnsi="Calibri"/>
+          <w:b/>
+          <w:bCs/>
+          <w:i w:val="false"/>
+          <w:iCs w:val="false"/>
+          <w:sz w:val="24"/>
+          <w:szCs w:val="24"/>
+        </w:rPr>
+        <w:t xml:space="preserve">Caso de Prueba [CP-11]: Tabla de Cupos Reales con Desglose por Sexo y Estado Reservado</w:t>
+      </w:r>
+    </w:p>
+    <w:p>
+      <w:pPr>
+        <w:spacing w:after="120"/>
+      </w:pPr>
+      <w:r>
+        <w:rPr>
+          <w:rFonts w:ascii="Calibri" w:cs="Calibri" w:eastAsia="Calibri" w:hAnsi="Calibri"/>
+          <w:b w:val="false"/>
+          <w:bCs w:val="false"/>
+          <w:i w:val="false"/>
+          <w:iCs w:val="false"/>
+          <w:sz w:val="24"/>
+          <w:szCs w:val="24"/>
+        </w:rPr>
+        <w:t xml:space="preserve">• Categoría: Funcional — Integridad de datos en tiempo real</w:t>
+      </w:r>
+    </w:p>
+    <w:p>
+      <w:pPr>
+        <w:spacing w:after="120"/>
+      </w:pPr>
+      <w:r>
+        <w:rPr>
+          <w:rFonts w:ascii="Calibri" w:cs="Calibri" w:eastAsia="Calibri" w:hAnsi="Calibri"/>
+          <w:b w:val="false"/>
+          <w:bCs w:val="false"/>
+          <w:i w:val="false"/>
+          <w:iCs w:val="false"/>
+          <w:sz w:val="24"/>
+          <w:szCs w:val="24"/>
+        </w:rPr>
+        <w:t xml:space="preserve">• Entrada: Acceder al módulo 'Cursos y Secciones'. Verificar que las columnas ♀ Femenino y ♂ Masculino reflejen el conteo exacto de la tabla 'estudiantes' en MySQL, y que el grado se muestre completo (1er Grado, 2do Grado, etc.).</w:t>
+      </w:r>
+    </w:p>
+    <w:p>
+      <w:pPr>
+        <w:spacing w:after="120"/>
+      </w:pPr>
+      <w:r>
+        <w:rPr>
+          <w:rFonts w:ascii="Calibri" w:cs="Calibri" w:eastAsia="Calibri" w:hAnsi="Calibri"/>
+          <w:b w:val="false"/>
+          <w:bCs w:val="false"/>
+          <w:i w:val="false"/>
+          <w:iCs w:val="false"/>
+          <w:sz w:val="24"/>
+          <w:szCs w:val="24"/>
+        </w:rPr>
+        <w:t xml:space="preserve">• Resultado Esperado: Tabla de 14 filas (una por sección: Inicial A/B, 1er a 6to Grado A/B) con los campos: Cupo Total, ♀ Fem., ♂ Masc., Cupos Reservados (mostrando 'X reservados'), Cupos Disponibles (mostrando 'Y disponibles'), % de Ocupación y Maestro Encargado.</w:t>
+      </w:r>
+    </w:p>
+    <w:p>
+      <w:pPr>
+        <w:spacing w:after="120"/>
+      </w:pPr>
+      <w:r>
+        <w:rPr>
+          <w:rFonts w:ascii="Calibri" w:cs="Calibri" w:eastAsia="Calibri" w:hAnsi="Calibri"/>
+          <w:b w:val="false"/>
+          <w:bCs w:val="false"/>
+          <w:i w:val="false"/>
+          <w:iCs w:val="false"/>
+          <w:sz w:val="24"/>
+          <w:szCs w:val="24"/>
+        </w:rPr>
+        <w:t xml:space="preserve">• Resultado Obtenido: Exitoso. Los datos provienen en tiempo real del endpoint GET /api/courses/seccion-cupos. La fila de TOTALES GENERALES suma correctamente. Las barras de progreso cambian de verde a amarillo al superar el 80% de ocupación.</w:t>
+      </w:r>
+    </w:p>
+    <w:p>
+      <w:pPr>
+        <w:spacing w:after="120"/>
+      </w:pPr>
+      <w:r>
+        <w:rPr>
+          <w:rFonts w:ascii="Calibri" w:cs="Calibri" w:eastAsia="Calibri" w:hAnsi="Calibri"/>
+          <w:b/>
+          <w:bCs/>
+          <w:i w:val="false"/>
+          <w:iCs w:val="false"/>
+          <w:sz w:val="24"/>
+          <w:szCs w:val="24"/>
+        </w:rPr>
+        <w:t xml:space="preserve">• Estado: PASA</w:t>
+      </w:r>
+    </w:p>
+    <w:p/>
+    <w:p>
+      <w:pPr>
+        <w:spacing w:after="120"/>
+      </w:pPr>
+      <w:r>
+        <w:rPr>
+          <w:rFonts w:ascii="Calibri" w:cs="Calibri" w:eastAsia="Calibri" w:hAnsi="Calibri"/>
+          <w:b/>
+          <w:bCs/>
+          <w:i w:val="false"/>
+          <w:iCs w:val="false"/>
+          <w:sz w:val="24"/>
+          <w:szCs w:val="24"/>
+        </w:rPr>
+        <w:t xml:space="preserve">Caso de Prueba [CP-12]: Asistencia Consolidada por Sexo sin Nombres y con Maestro Encargado</w:t>
+      </w:r>
+    </w:p>
+    <w:p>
+      <w:pPr>
+        <w:spacing w:after="120"/>
+      </w:pPr>
+      <w:r>
+        <w:rPr>
+          <w:rFonts w:ascii="Calibri" w:cs="Calibri" w:eastAsia="Calibri" w:hAnsi="Calibri"/>
+          <w:b w:val="false"/>
+          <w:bCs w:val="false"/>
+          <w:i w:val="false"/>
+          <w:iCs w:val="false"/>
+          <w:sz w:val="24"/>
+          <w:szCs w:val="24"/>
+        </w:rPr>
+        <w:t xml:space="preserve">• Categoría: Funcional — Usabilidad y simplificación del pase de lista</w:t>
+      </w:r>
+    </w:p>
+    <w:p>
+      <w:pPr>
+        <w:spacing w:after="120"/>
+      </w:pPr>
+      <w:r>
+        <w:rPr>
+          <w:rFonts w:ascii="Calibri" w:cs="Calibri" w:eastAsia="Calibri" w:hAnsi="Calibri"/>
+          <w:b w:val="false"/>
+          <w:bCs w:val="false"/>
+          <w:i w:val="false"/>
+          <w:iCs w:val="false"/>
+          <w:sz w:val="24"/>
+          <w:szCs w:val="24"/>
+        </w:rPr>
+        <w:t xml:space="preserve">• Entrada: Módulo 'Asistencia'. Seleccionar '3er Grado' - Sección 'A'. Verificar que no se muestre el listado individual de nombres de los alumnos. El sistema muestra tarjetas separadas para la asistencia ♀ Femenina y ♂ Masculina con inputs numéricos para Presentes, Ausentes, Tardanzas y Excusas. Modificar Femenino a 3 Presentes y 1 Ausente, y Masculino a 4 Presentes. Cambiar docente a 'Prof. Rafael Almonte'.</w:t>
+      </w:r>
+    </w:p>
+    <w:p>
+      <w:pPr>
+        <w:spacing w:after="120"/>
+      </w:pPr>
+      <w:r>
+        <w:rPr>
+          <w:rFonts w:ascii="Calibri" w:cs="Calibri" w:eastAsia="Calibri" w:hAnsi="Calibri"/>
+          <w:b w:val="false"/>
+          <w:bCs w:val="false"/>
+          <w:i w:val="false"/>
+          <w:iCs w:val="false"/>
+          <w:sz w:val="24"/>
+          <w:szCs w:val="24"/>
+        </w:rPr>
+        <w:t xml:space="preserve">• Resultado Esperado: (1) El docente a cargo se actualiza en el catálogo de cursos de forma permanente al presionar Enter. (2) Se valida en el frontend que la suma de inputs de cada tarjeta sea exactamente igual al total de alumnos registrados por sexo. (3) Al guardar, se distribuyen los estados equitativamente en la base de datos de manera automatizada.</w:t>
+      </w:r>
+    </w:p>
+    <w:p>
+      <w:pPr>
+        <w:spacing w:after="120"/>
+      </w:pPr>
+      <w:r>
+        <w:rPr>
+          <w:rFonts w:ascii="Calibri" w:cs="Calibri" w:eastAsia="Calibri" w:hAnsi="Calibri"/>
+          <w:b w:val="false"/>
+          <w:bCs w:val="false"/>
+          <w:i w:val="false"/>
+          <w:iCs w:val="false"/>
+          <w:sz w:val="24"/>
+          <w:szCs w:val="24"/>
+        </w:rPr>
+        <w:t xml:space="preserve">• Resultado Obtenido: Exitoso. Cumple la restricción de no exponer nombres en la lista. Se previene la carga cognitiva al docente permitiendo ingresar solo los totales correspondientes por sexo de manera rápida. La base de datos guarda correctamente los estados correspondientes.</w:t>
       </w:r>
     </w:p>
     <w:p>
@@ -2295,6 +2501,179 @@
         <w:t xml:space="preserve">• Corrección Aplicada: Se modificó server.js para permitir dinámicamente los orígenes definidos en process.env.FRONTEND_URL.</w:t>
       </w:r>
     </w:p>
+    <w:p/>
+    <w:p>
+      <w:pPr>
+        <w:spacing w:after="120"/>
+      </w:pPr>
+      <w:r>
+        <w:rPr>
+          <w:rFonts w:ascii="Calibri" w:cs="Calibri" w:eastAsia="Calibri" w:hAnsi="Calibri"/>
+          <w:b/>
+          <w:bCs/>
+          <w:i w:val="false"/>
+          <w:iCs w:val="false"/>
+          <w:sz w:val="24"/>
+          <w:szCs w:val="24"/>
+        </w:rPr>
+        <w:t xml:space="preserve">[Defecto-04]: El campo 'inscritos' del frontend no se mapeaba al campo 'capacidad' de la BD</w:t>
+      </w:r>
+    </w:p>
+    <w:p>
+      <w:pPr>
+        <w:spacing w:after="120"/>
+      </w:pPr>
+      <w:r>
+        <w:rPr>
+          <w:rFonts w:ascii="Calibri" w:cs="Calibri" w:eastAsia="Calibri" w:hAnsi="Calibri"/>
+          <w:b w:val="false"/>
+          <w:bCs w:val="false"/>
+          <w:i w:val="false"/>
+          <w:iCs w:val="false"/>
+          <w:sz w:val="24"/>
+          <w:szCs w:val="24"/>
+        </w:rPr>
+        <w:t xml:space="preserve">• Severidad: Media (Los cupos mostrados en la tabla siempre eran 0 aunque hubiera estudiantes).</w:t>
+      </w:r>
+    </w:p>
+    <w:p>
+      <w:pPr>
+        <w:spacing w:after="120"/>
+      </w:pPr>
+      <w:r>
+        <w:rPr>
+          <w:rFonts w:ascii="Calibri" w:cs="Calibri" w:eastAsia="Calibri" w:hAnsi="Calibri"/>
+          <w:b w:val="false"/>
+          <w:bCs w:val="false"/>
+          <w:i w:val="false"/>
+          <w:iCs w:val="false"/>
+          <w:sz w:val="24"/>
+          <w:szCs w:val="24"/>
+        </w:rPr>
+        <w:t xml:space="preserve">• Pasos para Reproducir: Acceder al módulo 'Cursos y Secciones' y verificar la columna 'Inscritos'.</w:t>
+      </w:r>
+    </w:p>
+    <w:p>
+      <w:pPr>
+        <w:spacing w:after="120"/>
+      </w:pPr>
+      <w:r>
+        <w:rPr>
+          <w:rFonts w:ascii="Calibri" w:cs="Calibri" w:eastAsia="Calibri" w:hAnsi="Calibri"/>
+          <w:b w:val="false"/>
+          <w:bCs w:val="false"/>
+          <w:i w:val="false"/>
+          <w:iCs w:val="false"/>
+          <w:sz w:val="24"/>
+          <w:szCs w:val="24"/>
+        </w:rPr>
+        <w:t xml:space="preserve">• Evidencia: La columna en MySQL se llama 'capacidad' pero el frontend esperaba el campo 'inscritos'. El controlador devolvía el nombre original de la BD sin renombrar.</w:t>
+      </w:r>
+    </w:p>
+    <w:p>
+      <w:pPr>
+        <w:spacing w:after="120"/>
+      </w:pPr>
+      <w:r>
+        <w:rPr>
+          <w:rFonts w:ascii="Calibri" w:cs="Calibri" w:eastAsia="Calibri" w:hAnsi="Calibri"/>
+          <w:b w:val="false"/>
+          <w:bCs w:val="false"/>
+          <w:i w:val="false"/>
+          <w:iCs w:val="false"/>
+          <w:sz w:val="24"/>
+          <w:szCs w:val="24"/>
+        </w:rPr>
+        <w:t xml:space="preserve">• Corrección Aplicada: Se actualizó courseController.js para mapear capacidad → inscritos en todas las respuestas JSON del endpoint GET /api/courses. Adicionalmente, se creó el endpoint GET /api/courses/seccion-cupos que lee directamente desde la tabla estudiantes para mayor precisión.</w:t>
+      </w:r>
+    </w:p>
+    <w:p/>
+    <w:p>
+      <w:pPr>
+        <w:spacing w:after="120"/>
+      </w:pPr>
+      <w:r>
+        <w:rPr>
+          <w:rFonts w:ascii="Calibri" w:cs="Calibri" w:eastAsia="Calibri" w:hAnsi="Calibri"/>
+          <w:b/>
+          <w:bCs/>
+          <w:i w:val="false"/>
+          <w:iCs w:val="false"/>
+          <w:sz w:val="24"/>
+          <w:szCs w:val="24"/>
+        </w:rPr>
+        <w:t xml:space="preserve">[Defecto-05]: Entradas de texto manuales en lugar de menús desplegables select y desincronización de repositorio/despliegue</w:t>
+      </w:r>
+    </w:p>
+    <w:p>
+      <w:pPr>
+        <w:spacing w:after="120"/>
+      </w:pPr>
+      <w:r>
+        <w:rPr>
+          <w:rFonts w:ascii="Calibri" w:cs="Calibri" w:eastAsia="Calibri" w:hAnsi="Calibri"/>
+          <w:b w:val="false"/>
+          <w:bCs w:val="false"/>
+          <w:i w:val="false"/>
+          <w:iCs w:val="false"/>
+          <w:sz w:val="24"/>
+          <w:szCs w:val="24"/>
+        </w:rPr>
+        <w:t xml:space="preserve">• Severidad: Alta (Divergencia entre repositorio local y entorno de producción en Vercel/Render, e inconsistencia de datos al ingresar materias y docentes manualmente).</w:t>
+      </w:r>
+    </w:p>
+    <w:p>
+      <w:pPr>
+        <w:spacing w:after="120"/>
+      </w:pPr>
+      <w:r>
+        <w:rPr>
+          <w:rFonts w:ascii="Calibri" w:cs="Calibri" w:eastAsia="Calibri" w:hAnsi="Calibri"/>
+          <w:b w:val="false"/>
+          <w:bCs w:val="false"/>
+          <w:i w:val="false"/>
+          <w:iCs w:val="false"/>
+          <w:sz w:val="24"/>
+          <w:szCs w:val="24"/>
+        </w:rPr>
+        <w:t xml:space="preserve">• Pasos para Reproducir: (1) Ingresar a Calificaciones o Cursos e intentar seleccionar materia o docente encargado. (2) Verificar repositorio GitHub origin/main.</w:t>
+      </w:r>
+    </w:p>
+    <w:p>
+      <w:pPr>
+        <w:spacing w:after="120"/>
+      </w:pPr>
+      <w:r>
+        <w:rPr>
+          <w:rFonts w:ascii="Calibri" w:cs="Calibri" w:eastAsia="Calibri" w:hAnsi="Calibri"/>
+          <w:b w:val="false"/>
+          <w:bCs w:val="false"/>
+          <w:i w:val="false"/>
+          <w:iCs w:val="false"/>
+          <w:sz w:val="24"/>
+          <w:szCs w:val="24"/>
+        </w:rPr>
+        <w:t xml:space="preserve">• Evidencia: Los formularios usaban entradas de texto libre que permitían errores de sintaxis y el despliegue no reflejaba los últimos commits locales.</w:t>
+      </w:r>
+    </w:p>
+    <w:p>
+      <w:pPr>
+        <w:spacing w:after="120"/>
+      </w:pPr>
+      <w:r>
+        <w:rPr>
+          <w:rFonts w:ascii="Calibri" w:cs="Calibri" w:eastAsia="Calibri" w:hAnsi="Calibri"/>
+          <w:b w:val="false"/>
+          <w:bCs w:val="false"/>
+          <w:i w:val="false"/>
+          <w:iCs w:val="false"/>
+          <w:sz w:val="24"/>
+          <w:szCs w:val="24"/>
+        </w:rPr>
+        <w:t xml:space="preserve">• Corrección Aplicada: (1) Se transformaron los campos de Materia y Docente Encargado en elementos &lt;select&gt; poblados dinámicamente desde la base de datos en Grades.jsx, Courses.jsx y Attendance.jsx. (2) Se realizó git merge, git commit y git push origin main, reactivando los despliegues automáticos en Vercel y Render.</w:t>
+      </w:r>
+    </w:p>
+    <w:p/>
     <w:p>
       <w:pPr>
         <w:pStyle w:val="Heading1"/>
@@ -2318,7 +2697,7 @@
           <w:sz w:val="24"/>
           <w:szCs w:val="24"/>
         </w:rPr>
-        <w:t xml:space="preserve">El proceso de pruebas de sistema ha arrojado luz sobre una de las lecciones fundamentales del ciclo de desarrollo: la disparidad de entornos. Mientras el sistema funcionaba de forma impecable en el entorno local del desarrollador (localhost), el traslado al entorno desplegado reveló defectos de seguridad (bloqueos por CORS), referencias erróneas de endpoints que aún apuntaban a la máquina del desarrollador, y brechas estructurales en la base de datos (ausencia de la vista de base de datos personas y columnas obsoletas en las tablas heredadas). Las pruebas de caja negra permitieron validar el sistema completo desde la perspectiva del usuario final, garantizando que el flujo de datos fuera consistente a través de todas las capas de red y bases de datos reales en producción.</w:t>
+        <w:t xml:space="preserve">El proceso de pruebas de sistema ha arrojado luz sobre una de las lecciones fundamentales del ciclo de desarrollo: la disparidad de entornos. Mientras el sistema funcionaba de forma impecable en el entorno local del desarrollador (localhost), el traslado al entorno desplegado reveló defectos de seguridad (bloqueos por CORS), referencias erróneas de endpoints que aún apuntaban a la máquina del desarrollador, y brechas estructurales en la base de datos (ausencia de la vista de base de datos personas y columnas obsoletas en las tablas heredadas). Las pruebas de caja negra permitieron validar el sistema completo desde la perspectiva del usuario final, garantizando que el flujo de datos fuera consistente a través de todas las capas de red y bases de datos reales en producción. Adicionalmente, las iteraciones del ciclo de mejora continua produjeron 2 nuevas funcionalidades: (1) una tabla de cupos por sección con desglose ♀/♂ calculado en tiempo real desde MySQL, maestro encargado editable inline sin recargar la página; (2) un módulo de asistencia que presenta un resumen estadístico por sexo (Presentes, Ausentes, Tardanzas, Excusas y % de asistencia) con el docente a cargo editable manualmente, cumpliendo los 12 casos de prueba definidos.</w:t>
       </w:r>
     </w:p>
     <w:p>

</xml_diff>